<commit_message>
Add brief self reflection to Assignment 5 Agent Record
</commit_message>
<xml_diff>
--- a/agents/diffusion_agent/records/Meilin_Assignment_5_Diffusion_Agent_Record_v2.docx
+++ b/agents/diffusion_agent/records/Meilin_Assignment_5_Diffusion_Agent_Record_v2.docx
@@ -1990,6 +1990,22 @@
         </w:tc>
       </w:tr>
     </w:tbl>
+    <w:p>
+      <w:pPr>
+        <w:pStyle w:val="Heading1"/>
+      </w:pPr>
+      <w:r>
+        <w:t>F. Self Reflection</w:t>
+      </w:r>
+    </w:p>
+    <w:p>
+      <w:pPr>
+        <w:pStyle w:val="Normal"/>
+      </w:pPr>
+      <w:r>
+        <w:t>This assignment helped me see that widespread use of a technology does not prove that a specific application is ready for a bank. I still believe a conservative reputation builds trust, but excessive caution can become a bottleneck to service improvement. A protected evaluation with informed user consent can help the bank explore potential benefits while preserving advisor authority. Comparing the tests also reminded me that changing adoption posture does not always produce a different timetable when the consequences remain the same. I would focus on measured improvements and unresolved risks before supporting broader use.</w:t>
+      </w:r>
+    </w:p>
     <w:sectPr>
       <w:headerReference w:type="default" r:id="rId8"/>
       <w:footerReference w:type="default" r:id="rId9"/>

</xml_diff>